<commit_message>
fix(reproducibility): address audit findings (sample data, requirements, relative links, honest methodology claims, moved scripts)
</commit_message>
<xml_diff>
--- a/docs/Laporan_TK2_ANMEDSOS.docx
+++ b/docs/Laporan_TK2_ANMEDSOS.docx
@@ -1065,7 +1065,7 @@
               <w:br/>
               <w:t>[5. TEXT PREPROCESSING &amp; QUALITY RECONCILIATION]</w:t>
               <w:br/>
-              <w:t xml:space="preserve">   Unescape HTML, Unicode NFC, URL/Mention Stripping, Kamus Slang Formal (87 entri)</w:t>
+              <w:t xml:space="preserve">   Unescape HTML, Unicode NFC, URL/Mention Stripping, Kamus Slang Formal (16 pasangan kata)</w:t>
               <w:br/>
               <w:t xml:space="preserve">   Evaluasi Truncation, Cross-Validation mDeBERTa-v3-base-xnli, Filter URL-only</w:t>
               <w:br/>
@@ -1117,7 +1117,7 @@
           <w:rFonts w:ascii="Times New Roman" w:hAnsi="Times New Roman"/>
           <w:sz w:val="21"/>
         </w:rPr>
-        <w:t>Pengumpulan data diimplementasikan secara teknis memanfaatkan crawler terkelola Apify (scrapesmith/x-twitter-search-scraper) yang beroperasi melalui protokol REST API dengan otentikasi Bearer Token terenkripsi pada environment lokal (.env). Strategi pengumpulan menerapkan kueri Boolean terencana yang mencakup 36 kata kunci pencarian discovery, terbagi ke dalam empat kelompok tematik: Grup A (pencarian kerja umum: 'cari kerja', 'lowongan kerja', 'fresh graduate'), Grup B (keluhan kerja dan pemutusan hubungan kerja: 'susah cari kerja', 'PHK', 'gaji rendah', 'pengangguran'), Grup C (wacana migrasi: '#KaburAjaDulu', 'kerja di luar negeri', 'kerja di Jepang'), dan Grup D (istilah ketenagakerjaan bahasa Inggris: 'jobs in Indonesia', 'unemployment Indonesia'). Parameter pencarian spesifik mencakup pembatasan bahasa teks (lang:id), mode pencarian terkini (Latest), serta rentang tanggal sejak (since) dan hingga (until) sesuai jadwal sampling mingguan. Pengambilan data menerapkan penanganan pagination berbasis kursor dinamis (bottom cursor token) yang berulang secara teratur hingga batas kuota atau jendela waktu terpenuhi. Guna mematuhi batas laju platform (rate limiting) dan mencegah pemblokiran alamat IP, crawler dikonfigurasi dengan jeda acak (jitter) sebesar 2 hingga 5 detik antar-permintaan serta mekanisme penanganan kegagalan (error handling) berbasis exponential backoff dengan maksimal 3 kali percobaan ulang. Seluruh muatan data mentah diekstraksi ke dalam format JSON Lines (JSONL) pada data/raw/raw_tweets.jsonl yang memuat teks lengkap, atribut penulis, metrik publik (likes, retweets, replies), dan stempel waktu UTC asli secara persisten, menyediakan jejak audit yang transparan bagi keseluruhan penelitian.</w:t>
+        <w:t>Pengumpulan data diimplementasikan secara teknis memanfaatkan crawler terkelola Apify (scrapesmith/x-twitter-search-scraper) yang beroperasi melalui protokol REST API dengan otentikasi Bearer Token terenkripsi pada environment lokal (.env). Strategi pengumpulan menerapkan kueri Boolean terencana yang mencakup 36 kata kunci pencarian discovery, terbagi ke dalam empat kelompok tematik: Grup A (pencarian kerja umum: 'cari kerja', 'lowongan kerja', 'fresh graduate'), Grup B (keluhan kerja dan pemutusan hubungan kerja: 'susah cari kerja', 'PHK', 'gaji rendah', 'pengangguran'), Grup C (wacana migrasi: '#KaburAjaDulu', 'kerja di luar negeri', 'kerja di Jepang'), dan Grup D (istilah ketenagakerjaan bahasa Inggris: 'jobs in Indonesia', 'unemployment Indonesia'). Konstruksi kueri menggabungkan frasa pencarian leksikal dengan pembatas rentang waktu sejak (since) dan hingga (until) sesuai jadwal sampling mingguan serta mode pengurutan cuitan terkini (Latest). Pengambilan data mentah menerapkan penanganan pagination berbasis offset bertahap pada endpoint dataset Apify hingga seluruh item hasil pencarian berhasil diekstraksi ke penyimpanan lokal. Pemantauan eksekusi dilakukan melalui polling status run secara berkala dengan interval 5 detik hingga batas maksimum 120 iterasi. Setiap kegagalan tugas atau timeout dicatat secara transparan pada struktur log run (status ERROR) guna menjamin akuntabilitas audit tanpa mengorbankan integritas data historis. Seluruh rekaman mentah diekstraksi ke format JSON Lines pada data/raw/raw_tweets.jsonl yang memuat muatan lengkap, atribut penulis, metrik publik (likes, retweets, replies), dan stempel waktu UTC asli, menyediakan basis audit yang kuat bagi keseluruhan penelitian.</w:t>
       </w:r>
     </w:p>
     <w:p>
@@ -1145,7 +1145,7 @@
           <w:rFonts w:ascii="Times New Roman" w:hAnsi="Times New Roman"/>
           <w:sz w:val="21"/>
         </w:rPr>
-        <w:t>Implementasi pipeline pengumpulan dan persiapan data telah dieksekusi secara nyata dan berhasil menghasilkan dataset riset yang siap dianalisis. Dari 3.292 rekaman mentah yang terkumpul pada data/raw/raw_tweets.jsonl, modul prepare.py menyaring 1.781 kandidat unik yang valid secara temporal pada zona waktu WIB. Modul semantic_screen.py kemudian menerapkan penyaringan relevansi hibrida yang memprioritaskan 95 keputusan audit manual manusia dan menyaring kandidat selebihnya menggunakan pengklasifikasi aturan leksikal-diskursus lokal, menghasilkan 1.492 postingan terpilih. Tahap pra-pemrosesan teks dieksekusi secara deterministik melalui modul preprocess_text.py yang menjalankan normalisasi Unicode NFC, unescape entitas HTML, penghapusan tautan URL dan mention pengguna (@username), casefolding, serta substitusi kata gaul dan singkatan non-baku menggunakan kamus formal 87 pasangan kata (config/slang_dictionary.json). Tiga representasi teks dihasilkan secara konsisten: text_clean, text_topic, dan text_sentiment. Dalam audit kualitas pra-pemrosesan, ditemukan satu postingan URL-only (post_id: 2030131219137278032) yang menghasilkan string kosong setelah pembersihan tautan, sehingga dipisahkan secara transparan ke dalam data/releases/tk2_v1/exclusion_log.csv dengan alasan text_empty_after_preprocessing. Korpus akhir resmi dibekukan pada data/releases/tk2_v1/corpus.csv dan preprocessed.csv sebanyak 1.491 postingan riset bersih dengan cakupan multi-label yang solid (RQ1: 985 cuitan/66,06%, RQ2 Personal: 207 cuitan/13,88%, RQ2 Publik: 447 cuitan/29,98%, dan RQ2 Kausal: 8 cuitan/0,54%). Seluruh kode program, konfigurasi, dan test suite terorganisir rapi dan dapat diakses secara publik pada repositori GitHub resmi: https://github.com/rerearuan/kaburajadulu-analitik.git.</w:t>
+        <w:t>Implementasi pipeline pengumpulan dan persiapan data telah dieksekusi secara nyata dan berhasil menghasilkan dataset riset yang siap dianalisis. Dari 3.292 rekaman mentah yang terkumpul pada data/raw/raw_tweets.jsonl, modul prepare.py menyaring 1.781 kandidat unik yang valid secara temporal pada zona waktu WIB. Modul semantic_screen.py kemudian menerapkan penyaringan relevansi hibrida yang memprioritaskan 95 keputusan audit manual manusia dan menyaring kandidat selebihnya menggunakan pengklasifikasi aturan leksikal-diskursus lokal, menghasilkan 1.492 postingan terpilih. Tahap pra-pemrosesan teks dieksekusi secara deterministik melalui modul preprocess_text.py yang menjalankan normalisasi Unicode NFC, unescape entitas HTML, penghapusan tautan URL dan mention pengguna (@username), casefolding, serta substitusi kata gaul dan singkatan non-baku menggunakan kamus formal 16 pasangan kata leksikal ketenagakerjaan (config/slang_dictionary.json). Tiga representasi teks dihasilkan secara konsisten untuk analisis bertahap: text_clean, text_topic, dan text_sentiment. Dalam audit kualitas pra-pemrosesan, ditemukan satu postingan URL-only (post_id: 2030131219137278032) yang menghasilkan string kosong setelah pembersihan tautan, sehingga dipisahkan secara transparan ke dalam data/releases/tk2_v1/exclusion_log.csv dengan alasan text_empty_after_preprocessing. Korpus akhir resmi dibekukan pada data/releases/tk2_v1/corpus.csv dan preprocessed.csv sebanyak 1.491 postingan riset bersih dengan cakupan multi-label yang solid (RQ1: 985 cuitan/66,06%, RQ2 Personal: 207 cuitan/13,88%, RQ2 Publik: 447 cuitan/29,98%, dan RQ2 Kausal: 8 cuitan/0,54%). Seluruh kode program, konfigurasi, dan test suite terorganisir rapi dan dapat diakses secara publik pada repositori GitHub resmi: https://github.com/rerearuan/kaburajadulu-analitik.git.</w:t>
       </w:r>
     </w:p>
     <w:p>

</xml_diff>